<commit_message>
docs: segmentar socios juniors (1ro y 2do) y seniors (3ro a 6to) segun estatuto
</commit_message>
<xml_diff>
--- a/docs/TPI_Estudio_Inicial_SGD_AVEIT.docx
+++ b/docs/TPI_Estudio_Inicial_SGD_AVEIT.docx
@@ -364,7 +364,7 @@
                 <w:rFonts w:ascii="Calibri" w:hAnsi="Calibri"/>
                 <w:sz w:val="20"/>
               </w:rPr>
-              <w:t>15 de Agosto de 2026</w:t>
+              <w:t>16 de Agosto de 2026</w:t>
             </w:r>
           </w:p>
         </w:tc>
@@ -742,6 +742,88 @@
           </w:p>
         </w:tc>
       </w:tr>
+      <w:tr>
+        <w:tc>
+          <w:tcPr>
+            <w:tcW w:type="dxa" w:w="1296"/>
+            <w:tcMar>
+              <w:top w:w="70" w:type="dxa"/>
+              <w:bottom w:w="70" w:type="dxa"/>
+              <w:left w:w="90" w:type="dxa"/>
+              <w:right w:w="90" w:type="dxa"/>
+            </w:tcMar>
+          </w:tcPr>
+          <w:p>
+            <w:r>
+              <w:rPr>
+                <w:rFonts w:ascii="Calibri" w:hAnsi="Calibri"/>
+                <w:sz w:val="17"/>
+              </w:rPr>
+              <w:t>1.3.0</w:t>
+            </w:r>
+          </w:p>
+        </w:tc>
+        <w:tc>
+          <w:tcPr>
+            <w:tcW w:type="dxa" w:w="1584"/>
+            <w:tcMar>
+              <w:top w:w="70" w:type="dxa"/>
+              <w:bottom w:w="70" w:type="dxa"/>
+              <w:left w:w="90" w:type="dxa"/>
+              <w:right w:w="90" w:type="dxa"/>
+            </w:tcMar>
+          </w:tcPr>
+          <w:p>
+            <w:r>
+              <w:rPr>
+                <w:rFonts w:ascii="Calibri" w:hAnsi="Calibri"/>
+                <w:sz w:val="17"/>
+              </w:rPr>
+              <w:t>16/08/2026</w:t>
+            </w:r>
+          </w:p>
+        </w:tc>
+        <w:tc>
+          <w:tcPr>
+            <w:tcW w:type="dxa" w:w="2592"/>
+            <w:tcMar>
+              <w:top w:w="70" w:type="dxa"/>
+              <w:bottom w:w="70" w:type="dxa"/>
+              <w:left w:w="90" w:type="dxa"/>
+              <w:right w:w="90" w:type="dxa"/>
+            </w:tcMar>
+          </w:tcPr>
+          <w:p>
+            <w:r>
+              <w:rPr>
+                <w:rFonts w:ascii="Calibri" w:hAnsi="Calibri"/>
+                <w:sz w:val="17"/>
+              </w:rPr>
+              <w:t>Equipo SGD-AVEIT</w:t>
+            </w:r>
+          </w:p>
+        </w:tc>
+        <w:tc>
+          <w:tcPr>
+            <w:tcW w:type="dxa" w:w="3888"/>
+            <w:tcMar>
+              <w:top w:w="70" w:type="dxa"/>
+              <w:bottom w:w="70" w:type="dxa"/>
+              <w:left w:w="90" w:type="dxa"/>
+              <w:right w:w="90" w:type="dxa"/>
+            </w:tcMar>
+          </w:tcPr>
+          <w:p>
+            <w:r>
+              <w:rPr>
+                <w:rFonts w:ascii="Calibri" w:hAnsi="Calibri"/>
+                <w:sz w:val="17"/>
+              </w:rPr>
+              <w:t>Armonización integral con el Estatuto Social 2026 respecto a la segmentación estatutaria: Socios Juniors (1º y 2º año) y Socios Seniors (3º a 6º año social), y sus efectos sobre gestión operativa y régimen disciplinario.</w:t>
+            </w:r>
+          </w:p>
+        </w:tc>
+      </w:tr>
     </w:tbl>
     <w:p>
       <w:pPr>
@@ -859,7 +941,7 @@
           <w:rFonts w:ascii="Calibri" w:hAnsi="Calibri"/>
           <w:sz w:val="21"/>
         </w:rPr>
-        <w:t xml:space="preserve">    3.4. Dimensionamiento</w:t>
+        <w:t xml:space="preserve">    3.4. Dimensionamiento y Categorías de Socios</w:t>
       </w:r>
     </w:p>
     <w:p>
@@ -1162,7 +1244,7 @@
                 <w:rFonts w:ascii="Calibri" w:hAnsi="Calibri"/>
                 <w:sz w:val="19"/>
               </w:rPr>
-              <w:t>Órgano estatutario independiente encargado de juzgar las transgresiones reglamentarias, evaluar conductas, otorgar premios y aplicar sanciones a los socios (3 titulares y 3 suplentes de 4º, 5º y 6º año social).</w:t>
+              <w:t>Órgano estatutario independiente encargado de juzgar las transgresiones reglamentarias, evaluar conductas, otorgar premios y aplicar sanciones a los socios (3 titulares y 3 suplentes electos por Asamblea entre Socios Seniors).</w:t>
             </w:r>
           </w:p>
         </w:tc>
@@ -1209,6 +1291,96 @@
                 <w:sz w:val="19"/>
               </w:rPr>
               <w:t>Órganos operativos de trabajo creados por estatuto y reglamento: Cómputos, Relaciones Institucionales, Organización y Eventos, Prensa y Difusión, Mantenimiento, Recursos Humanos, y Gestión Social y Ambiental.</w:t>
+            </w:r>
+          </w:p>
+        </w:tc>
+      </w:tr>
+      <w:tr>
+        <w:tc>
+          <w:tcPr>
+            <w:tcW w:type="dxa" w:w="3168"/>
+            <w:tcMar>
+              <w:top w:w="60" w:type="dxa"/>
+              <w:bottom w:w="60" w:type="dxa"/>
+              <w:left w:w="100" w:type="dxa"/>
+              <w:right w:w="100" w:type="dxa"/>
+            </w:tcMar>
+          </w:tcPr>
+          <w:p>
+            <w:r>
+              <w:rPr>
+                <w:rFonts w:ascii="Calibri" w:hAnsi="Calibri"/>
+                <w:b/>
+                <w:color w:val="003366"/>
+                <w:sz w:val="19"/>
+              </w:rPr>
+              <w:t>Socio Junior</w:t>
+            </w:r>
+          </w:p>
+        </w:tc>
+        <w:tc>
+          <w:tcPr>
+            <w:tcW w:type="dxa" w:w="6192"/>
+            <w:tcMar>
+              <w:top w:w="60" w:type="dxa"/>
+              <w:bottom w:w="60" w:type="dxa"/>
+              <w:left w:w="100" w:type="dxa"/>
+              <w:right w:w="100" w:type="dxa"/>
+            </w:tcMar>
+          </w:tcPr>
+          <w:p>
+            <w:r>
+              <w:rPr>
+                <w:rFonts w:ascii="Calibri" w:hAnsi="Calibri"/>
+                <w:sz w:val="19"/>
+              </w:rPr>
+              <w:t>Socio ordinario perteneciente al 1º o 2º año social en etapa formativa y de integración institucional.</w:t>
+            </w:r>
+          </w:p>
+        </w:tc>
+      </w:tr>
+      <w:tr>
+        <w:tc>
+          <w:tcPr>
+            <w:tcW w:type="dxa" w:w="3168"/>
+            <w:tcMar>
+              <w:top w:w="60" w:type="dxa"/>
+              <w:bottom w:w="60" w:type="dxa"/>
+              <w:left w:w="100" w:type="dxa"/>
+              <w:right w:w="100" w:type="dxa"/>
+            </w:tcMar>
+            <w:shd w:fill="F9FBFD"/>
+          </w:tcPr>
+          <w:p>
+            <w:r>
+              <w:rPr>
+                <w:rFonts w:ascii="Calibri" w:hAnsi="Calibri"/>
+                <w:b/>
+                <w:color w:val="003366"/>
+                <w:sz w:val="19"/>
+              </w:rPr>
+              <w:t>Socio Senior</w:t>
+            </w:r>
+          </w:p>
+        </w:tc>
+        <w:tc>
+          <w:tcPr>
+            <w:tcW w:type="dxa" w:w="6192"/>
+            <w:tcMar>
+              <w:top w:w="60" w:type="dxa"/>
+              <w:bottom w:w="60" w:type="dxa"/>
+              <w:left w:w="100" w:type="dxa"/>
+              <w:right w:w="100" w:type="dxa"/>
+            </w:tcMar>
+            <w:shd w:fill="F9FBFD"/>
+          </w:tcPr>
+          <w:p>
+            <w:r>
+              <w:rPr>
+                <w:rFonts w:ascii="Calibri" w:hAnsi="Calibri"/>
+                <w:sz w:val="19"/>
+              </w:rPr>
+              <w:t>Socio ordinario perteneciente al 3º, 4º, 5º o 6º año social con mayores atribuciones de gestión, asignación de tareas en subcomisiones y elegibilidad para órganos estatutarios.</w:t>
             </w:r>
           </w:p>
         </w:tc>
@@ -1388,7 +1560,7 @@
                 <w:rFonts w:ascii="Calibri" w:hAnsi="Calibri"/>
                 <w:sz w:val="19"/>
               </w:rPr>
-              <w:t>Acto formal de cierre con estructura de VISTOS, CONSIDERANDOS y RESOLUCIÓN, refrendado por firma colegiada de miembros de 4º, 5º y 6º año social.</w:t>
+              <w:t>Acto formal de cierre con estructura de VISTOS, CONSIDERANDOS y RESOLUCIÓN, refrendado por firma colegiada de miembros del tribunal.</w:t>
             </w:r>
           </w:p>
         </w:tc>
@@ -1602,7 +1774,7 @@
         <w:spacing w:line="276" w:lineRule="auto" w:after="120"/>
       </w:pPr>
       <w:r>
-        <w:t>Para sustentar esta estructura asociativa de más de 500 socios, AVEIT cuenta con un estricto Estatuto Social, un Reglamento Interno de Disciplina y un Reglamento Procesal Disciplinario orientados a garantizar la equidad, el cumplimiento de los deberes sociales y la convivencia institucional. Dentro de este esquema, el Tribunal de Disciplina (TD) es el órgano clave responsable de dictaminar sobre faltas, administrar descargos y otorgar incentivos y penalizaciones a través de un sistema de puntaje acumulativo.</w:t>
+        <w:t>Para sustentar esta estructura asociativa de más de 500 socios (divididos entre Socios Juniors de 1º a 2º año y Socios Seniors de 3º a 6º año social), AVEIT cuenta con un estricto Estatuto Social, un Reglamento Interno de Disciplina y un Reglamento Procesal Disciplinario orientados a garantizar la equidad, el cumplimiento de los deberes sociales y la convivencia institucional. Dentro de este esquema, el Tribunal de Disciplina (TD) es el órgano clave responsable de dictaminar sobre faltas, administrar descargos y otorgar incentivos y penalizaciones a través de un sistema de puntaje acumulativo.</w:t>
       </w:r>
     </w:p>
     <w:p>
@@ -1650,7 +1822,7 @@
         <w:spacing w:line="276" w:lineRule="auto" w:after="60"/>
       </w:pPr>
       <w:r>
-        <w:t>Describir formalmente la organización beneficiaria (A.V.E.I.T.), su estructura orgánica (Asamblea, CD de 7 miembros, TD de 6 miembros y 7 Subcomisiones reglamentarias), historia, dimensionamiento operativo, layout físico y políticas de gobierno.</w:t>
+        <w:t>Describir formalmente la organización beneficiaria (A.V.E.I.T.), su estructura orgánica (Asamblea, CD de 7 miembros, TD de 6 miembros y 7 Subcomisiones reglamentarias), historia, dimensionamiento operativo, segmentación de socios Juniors (1º y 2º año) y Seniors (3º a 6º año), layout físico y políticas de gobierno.</w:t>
       </w:r>
     </w:p>
     <w:p>
@@ -1798,7 +1970,7 @@
           <w:color w:val="2980B9"/>
           <w:sz w:val="26"/>
         </w:rPr>
-        <w:t>3.4. Dimensionamiento</w:t>
+        <w:t>3.4. Dimensionamiento y Categorías de Socios</w:t>
       </w:r>
     </w:p>
     <w:p>
@@ -1806,7 +1978,11 @@
         <w:spacing w:line="276" w:lineRule="auto" w:after="80"/>
       </w:pPr>
       <w:r>
-        <w:t>• Padrón de Socios Activos: Aprox. 515 socios activos distribuidos en grupos de 1º a 6º año social.</w:t>
+        <w:t>• Padrón de Socios Activos: Aprox. 515 socios activos categorizados según el Estatuto:</w:t>
+        <w:br/>
+        <w:t xml:space="preserve">  - Socios Juniors: 1º y 2º año social (etapa formativa inicial).</w:t>
+        <w:br/>
+        <w:t xml:space="preserve">  - Socios Seniors: 3º, 4º, 5º y 6º año social (gestión operativa, subcomisiones, elegibilidad TD y grupo viajero).</w:t>
         <w:br/>
         <w:t>• Socios Pasivos: Varias decenas de socios pasivos y honorarios.</w:t>
         <w:br/>
@@ -1814,7 +1990,7 @@
         <w:br/>
         <w:t xml:space="preserve">  - Comisión Directiva: 7 miembros (Presidente, Vicepresidente, Tesorero, Protesorero, Secretario General, Prosecretario y Secretario de Actas).</w:t>
         <w:br/>
-        <w:t xml:space="preserve">  - Tribunal de Disciplina: 6 miembros (3 titulares y 3 suplentes electos por Asamblea, de 4º, 5º y 6º año social).</w:t>
+        <w:t xml:space="preserve">  - Tribunal de Disciplina: 6 miembros (3 titulares y 3 suplentes electos por Asamblea entre Socios Seniors).</w:t>
         <w:br/>
         <w:t xml:space="preserve">  - Comisión Revisora de Cuentas: 3 miembros.</w:t>
         <w:br/>
@@ -1847,7 +2023,7 @@
       <w:r>
         <w:t>1. Dualidad Normativa: La versión 2018 es el último reglamento aprobado por Asamblea (esquema físico en papel), mientras que la versión 2026 refleja el flujo de trabajo real y digitalizado de la institución.</w:t>
         <w:br/>
-        <w:t>2. Los 6 Estados Oficiales del Expediente (Art. 12 Reg. 2026): 1) Expediente Creado, 2) En período de justificaciones (5 días hábiles con T02/T03), 3) Justificaciones en revisión, 4) En espera de resolución, 5) Pendiente de firma y envío (firma de 4º, 5º y 6º año), y 6) Expedientes emitidos.</w:t>
+        <w:t>2. Los 6 Estados Oficiales del Expediente (Art. 12 Reg. 2026): 1) Expediente Creado, 2) En período de justificaciones (5 días hábiles con T02/T03), 3) Justificaciones en revisión, 4) En espera de resolución, 5) Pendiente de firma y envío (firma de Seniors), y 6) Expedientes emitidos.</w:t>
         <w:br/>
         <w:t>3. Catálogo de Formularios: T01 (Solicitud de premio/sanción con Anexo formal por autoridades), T02 (Justificación tipificada con adjuntos) y T03 (Descargo extraordinario).</w:t>
         <w:br/>
@@ -1880,7 +2056,7 @@
       <w:r>
         <w:t>• Macroprocesos Estratégicos: Gestión de Gobierno y Asambleas, Planificación Directiva de Comisión Directiva (7 miembros), y Estrategia y Relaciones Institucionales del Viaje.</w:t>
         <w:br/>
-        <w:t>• Macroprocesos Operativos / Misionales: Campaña y Admisión de Socios, Formación de Habilidades Blandas, Gestión Operativa de las 7 Subcomisiones, Logística del Viaje a Europa, y Eventos / Gran Rifa.</w:t>
+        <w:t>• Macroprocesos Operativos / Misionales: Campaña y Admisión de Socios (Juniors), Formación de Habilidades Blandas, Gestión Operativa de las 7 Subcomisiones (Seniors), Logística del Viaje a Europa, y Eventos / Gran Rifa.</w:t>
         <w:br/>
         <w:t>• Macroprocesos de Soporte / Apoyo: Gestión del Tribunal de Disciplina y Premiaciones (foco SGD-AVEIT), Administración Financiera / Tesorería, Mantenimiento e Infraestructura, y Soporte Informático.</w:t>
       </w:r>
@@ -1976,7 +2152,7 @@
       <w:r>
         <w:t>Disparador: Plazo de 5 días vencido o descargos presentados.</w:t>
         <w:br/>
-        <w:t>Actividades: En sesión virtual o presencial, el TD verifica conflictos de interés (activando suplentes); analiza pruebas y jurisprudencia; emite votos fundados en la plataforma web; redacta la Resolución (Vistos, Considerandos y Resolución) y se formaliza la firma digital de al menos un miembro de cada grupo social (4º, 5º y 6º año).</w:t>
+        <w:t>Actividades: En sesión virtual o presencial, el TD verifica conflictos de interés (activando suplentes); analiza pruebas y jurisprudencia; emite votos fundados en la plataforma web; redacta la Resolución (Vistos, Considerandos y Resolución) y se formaliza la firma digital de los miembros de tribunal.</w:t>
         <w:br/>
         <w:t>Salida: Expediente en estado "Pendiente de firma y envío" y posterior "Expedientes ya emitidos".</w:t>
       </w:r>
@@ -2030,7 +2206,7 @@
       <w:r>
         <w:t>Disparador: Fecha de corte cuatrimestral estatutaria.</w:t>
         <w:br/>
-        <w:t>Actividades: Las autoridades seleccionan el período cuatrimestral en la plataforma web; el sistema compila instantáneamente el Informe y Balance Cuatrimestral de Premiaciones y Sanciones por subcomisión y grupo social; se exporta firmado digitalmente para Comisión Directiva y Asamblea.</w:t>
+        <w:t>Actividades: Las autoridades seleccionan el período cuatrimestral en la plataforma web; el sistema compila instantáneamente el Informe y Balance Cuatrimestral de Premiaciones y Sanciones por subcomisión y grupo social (diferenciando Juniors y Seniors); se exporta firmado digitalmente para Comisión Directiva y Asamblea.</w:t>
         <w:br/>
         <w:t>Salida: Balance Cuatrimestral de Disciplina oficial listo para su tratamiento institucional.</w:t>
       </w:r>
@@ -2597,7 +2773,7 @@
         <w:rPr>
           <w:rFonts w:ascii="Calibri" w:hAnsi="Calibri"/>
         </w:rPr>
-        <w:t>Las deliberaciones del TD son predominantemente virtuales; la falta de una herramienta web responsive dificulta la votación estructurada, la firma colegiada de 4º, 5º y 6º año social y la emisión ágil de fallos.</w:t>
+        <w:t>Las deliberaciones del TD son predominantemente virtuales; la falta de una herramienta web responsive dificulta la votación estructurada, la firma colegiada de miembros y la emisión ágil de fallos.</w:t>
       </w:r>
     </w:p>
     <w:p>
@@ -2783,7 +2959,7 @@
         <w:rPr>
           <w:rFonts w:ascii="Calibri" w:hAnsi="Calibri"/>
         </w:rPr>
-        <w:t>Herramientas integradas en la plataforma web que permiten a las integrantes del TD conectarse desde sus dispositivos móviles durante reuniones virtuales, emitir votos nominales fundados, registrar firmas de 4º, 5º y 6º año y promulgar resoluciones inmediatas.</w:t>
+        <w:t>Herramientas integradas en la plataforma web que permiten a las miembros del TD conectarse desde sus dispositivos móviles durante reuniones virtuales, emitir votos nominales fundados, registrar firmas colegiadas de Socios Seniors y promulgar resoluciones inmediatas.</w:t>
       </w:r>
     </w:p>
     <w:sectPr>

</xml_diff>

<commit_message>
docs: explicitación de documentos normativos en referencias a artículos y actualización de DOCX
</commit_message>
<xml_diff>
--- a/docs/TPI_Estudio_Inicial_SGD_AVEIT.docx
+++ b/docs/TPI_Estudio_Inicial_SGD_AVEIT.docx
@@ -217,7 +217,7 @@
                 <w:rFonts w:ascii="Calibri" w:hAnsi="Calibri"/>
                 <w:sz w:val="20"/>
               </w:rPr>
-              <w:t>Sistematizar, auditar y transparentar la gestión integral de expedientes disciplinarios, sustanciación de descargos (Formularios T01, T02, T03), cómputo algorítmico de saldos de puntos y generación automática de balances cuatrimestrales mediante una plataforma 100% web y responsive mobile.</w:t>
+              <w:t>Sistematizar, auditar y transparentar la gestión integral de expedientes disciplinarios, sustanciación de descargos (Formularios T01, T02, T03), cómputo algorítmico de saldos de puntos y generación automática de balances cuatrimestrales mediante una plataforma 100% web y responsive mobile alineada al Estatuto Social y normativas procesales vigentes.</w:t>
             </w:r>
           </w:p>
         </w:tc>
@@ -364,7 +364,7 @@
                 <w:rFonts w:ascii="Calibri" w:hAnsi="Calibri"/>
                 <w:sz w:val="20"/>
               </w:rPr>
-              <w:t>16 de Agosto de 2026</w:t>
+              <w:t>18 de Agosto de 2026</w:t>
             </w:r>
           </w:p>
         </w:tc>
@@ -737,7 +737,7 @@
                 <w:rFonts w:ascii="Calibri" w:hAnsi="Calibri"/>
                 <w:sz w:val="17"/>
               </w:rPr>
-              <w:t>Incorporación del análisis comparativo entre Reglamento Procesal 2018 (aprobado por Asamblea) y 2026 (flujo real). Estandarización de 6 estados del expediente, formularios T01 (con Anexo), T02 y T03, competencias de inicio (Arts. 21-26) y firma colegiada.</w:t>
+              <w:t>Incorporación del análisis comparativo entre Reglamento Procesal 2018 (aprobado por Asamblea) y 2026 (flujo real). Estandarización de 6 estados del expediente, formularios T01 (con Anexo), T02 y T03, competencias de inicio (Arts. 21 a 26 del Reglamento Procesal Disciplinario 2026) y firma colegiada.</w:t>
             </w:r>
           </w:p>
         </w:tc>
@@ -820,6 +820,88 @@
                 <w:sz w:val="17"/>
               </w:rPr>
               <w:t>Armonización integral con el Estatuto Social 2026 respecto a la segmentación estatutaria: Socios Juniors (1º y 2º año) y Socios Seniors (3º a 6º año social), y sus efectos sobre gestión operativa y régimen disciplinario.</w:t>
+            </w:r>
+          </w:p>
+        </w:tc>
+      </w:tr>
+      <w:tr>
+        <w:tc>
+          <w:tcPr>
+            <w:tcW w:type="dxa" w:w="1296"/>
+            <w:tcMar>
+              <w:top w:w="70" w:type="dxa"/>
+              <w:bottom w:w="70" w:type="dxa"/>
+              <w:left w:w="90" w:type="dxa"/>
+              <w:right w:w="90" w:type="dxa"/>
+            </w:tcMar>
+          </w:tcPr>
+          <w:p>
+            <w:r>
+              <w:rPr>
+                <w:rFonts w:ascii="Calibri" w:hAnsi="Calibri"/>
+                <w:sz w:val="17"/>
+              </w:rPr>
+              <w:t>1.4.0</w:t>
+            </w:r>
+          </w:p>
+        </w:tc>
+        <w:tc>
+          <w:tcPr>
+            <w:tcW w:type="dxa" w:w="1584"/>
+            <w:tcMar>
+              <w:top w:w="70" w:type="dxa"/>
+              <w:bottom w:w="70" w:type="dxa"/>
+              <w:left w:w="90" w:type="dxa"/>
+              <w:right w:w="90" w:type="dxa"/>
+            </w:tcMar>
+          </w:tcPr>
+          <w:p>
+            <w:r>
+              <w:rPr>
+                <w:rFonts w:ascii="Calibri" w:hAnsi="Calibri"/>
+                <w:sz w:val="17"/>
+              </w:rPr>
+              <w:t>18/08/2026</w:t>
+            </w:r>
+          </w:p>
+        </w:tc>
+        <w:tc>
+          <w:tcPr>
+            <w:tcW w:type="dxa" w:w="2592"/>
+            <w:tcMar>
+              <w:top w:w="70" w:type="dxa"/>
+              <w:bottom w:w="70" w:type="dxa"/>
+              <w:left w:w="90" w:type="dxa"/>
+              <w:right w:w="90" w:type="dxa"/>
+            </w:tcMar>
+          </w:tcPr>
+          <w:p>
+            <w:r>
+              <w:rPr>
+                <w:rFonts w:ascii="Calibri" w:hAnsi="Calibri"/>
+                <w:sz w:val="17"/>
+              </w:rPr>
+              <w:t>Equipo SGD-AVEIT</w:t>
+            </w:r>
+          </w:p>
+        </w:tc>
+        <w:tc>
+          <w:tcPr>
+            <w:tcW w:type="dxa" w:w="3888"/>
+            <w:tcMar>
+              <w:top w:w="70" w:type="dxa"/>
+              <w:bottom w:w="70" w:type="dxa"/>
+              <w:left w:w="90" w:type="dxa"/>
+              <w:right w:w="90" w:type="dxa"/>
+            </w:tcMar>
+          </w:tcPr>
+          <w:p>
+            <w:r>
+              <w:rPr>
+                <w:rFonts w:ascii="Calibri" w:hAnsi="Calibri"/>
+                <w:sz w:val="17"/>
+              </w:rPr>
+              <w:t>Explicitación y estandarización de las fuentes documentales en la totalidad de las citas de artículos del documento (Estatuto Social de AVEIT, Reglamento Interno de Disciplina de AVEIT y Reglamento Procesal Disciplinario 2026).</w:t>
             </w:r>
           </w:p>
         </w:tc>
@@ -1424,7 +1506,7 @@
                 <w:rFonts w:ascii="Calibri" w:hAnsi="Calibri"/>
                 <w:sz w:val="19"/>
               </w:rPr>
-              <w:t>Instrumento formal mediante el cual autoridades de CD, Subcomisiones o Líderes solicitan la apertura de un expediente de premio o sanción con detalle circunstanciado.</w:t>
+              <w:t>Instrumento formal mediante el cual autoridades de CD, Subcomisiones o Líderes solicitan la apertura de un expediente de premio o sanción con detalle circunstanciado (Arts. 16 y 16 BIS del Reglamento Procesal Disciplinario 2026).</w:t>
             </w:r>
           </w:p>
         </w:tc>
@@ -1470,7 +1552,7 @@
                 <w:rFonts w:ascii="Calibri" w:hAnsi="Calibri"/>
                 <w:sz w:val="19"/>
               </w:rPr>
-              <w:t>Formulario oficial para justificar inasistencias e incumplimientos por causales tipificadas (enfermedad, viajes, exámenes) con comprobantes digitales.</w:t>
+              <w:t>Formulario oficial para justificar inasistencias e incumplimientos por causales tipificadas en el Reglamento Interno de Disciplina de AVEIT (enfermedad, viajes, exámenes) con comprobantes digitales (Art. 17 del Reglamento Procesal Disciplinario 2026).</w:t>
             </w:r>
           </w:p>
         </w:tc>
@@ -1514,7 +1596,7 @@
                 <w:rFonts w:ascii="Calibri" w:hAnsi="Calibri"/>
                 <w:sz w:val="19"/>
               </w:rPr>
-              <w:t>Formulario de descargo extraordinario para exponer causales atípicas evaluadas bajo sana crítica y antecedentes jurisprudenciales.</w:t>
+              <w:t>Formulario de descargo extraordinario para exponer causales atípicas evaluadas bajo sana crítica y antecedentes jurisprudenciales (Art. 18 del Reglamento Procesal Disciplinario 2026).</w:t>
             </w:r>
           </w:p>
         </w:tc>
@@ -1604,7 +1686,7 @@
                 <w:rFonts w:ascii="Calibri" w:hAnsi="Calibri"/>
                 <w:sz w:val="19"/>
               </w:rPr>
-              <w:t>Unidad de medida acumulativa (fracciones mínimas de 0.5 pts). Al acumular 10 puntos negativos netos, el socio pierde automáticamente su condición asociativa.</w:t>
+              <w:t>Unidad de medida acumulativa (fracciones mínimas de 0.5 pts). Al acumular 10 puntos negativos netos, el socio pierde automáticamente su condición asociativa (Art. 93 del Reglamento Interno de Disciplina de AVEIT).</w:t>
             </w:r>
           </w:p>
         </w:tc>
@@ -1694,7 +1776,7 @@
                 <w:rFonts w:ascii="Calibri" w:hAnsi="Calibri"/>
                 <w:sz w:val="19"/>
               </w:rPr>
-              <w:t>Informe consolidado emitido dos veces al año que resume actuaciones, auditorías y saldos de premios/sanciones (Art. 137 Reglamento Interno).</w:t>
+              <w:t>Informe consolidado emitido dos veces al año que resume actuaciones, auditorías y saldos de premios/sanciones (Art. 137 del Reglamento Interno de Disciplina de AVEIT).</w:t>
             </w:r>
           </w:p>
         </w:tc>
@@ -1822,7 +1904,7 @@
         <w:spacing w:line="276" w:lineRule="auto" w:after="60"/>
       </w:pPr>
       <w:r>
-        <w:t>Describir formalmente la organización beneficiaria (A.V.E.I.T.), su estructura orgánica (Asamblea, CD de 7 miembros, TD de 6 miembros y 7 Subcomisiones reglamentarias), historia, dimensionamiento operativo, segmentación de socios Juniors (1º y 2º año) y Seniors (3º a 6º año), layout físico y políticas de gobierno.</w:t>
+        <w:t>Describir formalmente la organización beneficiaria (A.V.E.I.T.), su estructura orgánica (Asamblea General, CD de 7 miembros, TD de 6 miembros y 7 Subcomisiones reglamentarias), historia, dimensionamiento operativo, segmentación de socios Juniors (1º y 2º año) y Seniors (3º a 6º año), layout físico y políticas de gobierno.</w:t>
       </w:r>
     </w:p>
     <w:p>
@@ -1955,7 +2037,7 @@
         <w:spacing w:line="276" w:lineRule="auto" w:after="80"/>
       </w:pPr>
       <w:r>
-        <w:t>Fundada en 1965 por estudiantes de la UTN FRC, AVEIT nació bajo la convicción de complementar la formación universitaria mediante misiones de estudio internacionales autogestionadas. A lo largo de seis décadas y sucesivas reformas estatutarias (consolidando su última reforma en el Estatuto 2026), AVEIT ha formado a generaciones de ingenieros con alta vocación de servicio, mérito y responsabilidad asociativa.</w:t>
+        <w:t>Fundada en 1965 por estudiantes de la UTN FRC, AVEIT nació bajo la convicción de complementar la formación universitaria mediante misiones de estudio internacionales autogestionadas. A lo largo de seis décadas y sucesivas reformas estatutarias (consolidando su última reforma en el Estatuto 2026 y el Reglamento Interno de Disciplina 2026), AVEIT ha formado a generaciones de ingenieros con alta vocación de servicio, mérito y responsabilidad asociativa.</w:t>
       </w:r>
     </w:p>
     <w:p>
@@ -1978,11 +2060,11 @@
         <w:spacing w:line="276" w:lineRule="auto" w:after="80"/>
       </w:pPr>
       <w:r>
-        <w:t>• Padrón de Socios Activos: Aprox. 515 socios activos categorizados según el Estatuto:</w:t>
+        <w:t>• Padrón de Socios Activos: Aprox. 515 socios activos categorizados según el Estatuto Social de AVEIT:</w:t>
         <w:br/>
         <w:t xml:space="preserve">  - Socios Juniors: 1º y 2º año social (etapa formativa inicial).</w:t>
         <w:br/>
-        <w:t xml:space="preserve">  - Socios Seniors: 3º, 4º, 5º y 6º año social (gestión operativa, subcomisiones, elegibilidad TD y grupo viajero).</w:t>
+        <w:t xml:space="preserve">  - Socios Seniors: 3º, 4º, 5º y 6º año social (gestión operativa, subcomisiones, elegibilidad TD y grupo viajero en 6º año).</w:t>
         <w:br/>
         <w:t>• Socios Pasivos: Varias decenas de socios pasivos y honorarios.</w:t>
         <w:br/>
@@ -1998,7 +2080,7 @@
         <w:br/>
         <w:t>• Volumen Operativo: Decenas de expedientes anuales por faltas, justificaciones (T02/T03) y premios.</w:t>
         <w:br/>
-        <w:t>• Situación de Balances Cuatrimestrales: Si bien el Art. 137 del Reglamento Interno exige dos balances cuatrimestrales de auditoría al año, actualmente no se están presentando por la excesiva carga manual. SGD-AVEIT automatizará su generación para asegurar su cumplimiento regular.</w:t>
+        <w:t>• Situación de Balances Cuatrimestrales de Auditoría Interna: Si bien el Art. 137 del Reglamento Interno de Disciplina de AVEIT exige dos balances cuatrimestrales de auditoría al año, actualmente no se están presentando con regularidad por la excesiva carga manual. SGD-AVEIT automatizará su generación para asegurar su cumplimiento regular ante Comisión Directiva y Asambleas.</w:t>
       </w:r>
     </w:p>
     <w:p>
@@ -2021,17 +2103,17 @@
         <w:spacing w:line="276" w:lineRule="auto" w:after="80"/>
       </w:pPr>
       <w:r>
-        <w:t>1. Dualidad Normativa: La versión 2018 es el último reglamento aprobado por Asamblea (esquema físico en papel), mientras que la versión 2026 refleja el flujo de trabajo real y digitalizado de la institución.</w:t>
+        <w:t>1. Dualidad Normativa: La versión 2018 es el último reglamento aprobado formalmente por Asamblea General (esquema físico en papel), mientras que la versión 2026 refleja el flujo de trabajo real y digitalizado de la institución.</w:t>
         <w:br/>
-        <w:t>2. Los 6 Estados Oficiales del Expediente (Art. 12 Reg. 2026): 1) Expediente Creado, 2) En período de justificaciones (5 días hábiles con T02/T03), 3) Justificaciones en revisión, 4) En espera de resolución, 5) Pendiente de firma y envío (firma de Seniors), y 6) Expedientes emitidos.</w:t>
+        <w:t>2. Los Seis (6) Estados Oficiales del Expediente (Art. 12 del Reglamento Procesal Disciplinario 2026): 1) Expediente Creado, 2) En período de subida de justificaciones (5 días hábiles con T02/T03), 3) Las justificaciones están siendo revisadas, 4) En espera de resolución, 5) Pendiente de firma y envío (firma colegiada de Seniors), y 6) Expedientes ya emitidos.</w:t>
         <w:br/>
-        <w:t>3. Catálogo de Formularios: T01 (Solicitud de premio/sanción con Anexo formal por autoridades), T02 (Justificación tipificada con adjuntos) y T03 (Descargo extraordinario).</w:t>
+        <w:t>3. Catálogo de Formularios Administrativos Oficiales: Formulario T01 (Solicitud de Premiación o Sanción) y Hoja Anexo T01 (Arts. 16 y 16 BIS del Reglamento Procesal Disciplinario 2026) exclusivo para autoridades; Formulario T02 (Justificación Tipificada - Art. 17 del Reglamento Procesal Disciplinario 2026) con causales tipificadas en el Reglamento Interno de Disciplina de AVEIT; Formulario T03 (Descargo Extraordinario - Art. 18 del Reglamento Procesal Disciplinario 2026); y Circular 001/2026 del Tribunal de Disciplina (Arts. 20 y 20 BIS del Reglamento Procesal Disciplinario 2026).</w:t>
         <w:br/>
-        <w:t>4. Competencias de Inicio (Arts. 21-26): CD sobre socios/subcomisiones; Fiscalizadora sobre CD/Revisora/TD; Revisora sobre Tesorería; TD de oficio/rectificación; Subcomisiones sobre socios a su cargo.</w:t>
+        <w:t>4. Competencia de Autoridades para el Inicio de Acciones (Arts. 21 a 26 del Reglamento Procesal Disciplinario 2026): Comisión Directiva sobre socios y subcomisiones; Comisión Fiscalizadora sobre CD, Comisión Revisora y TD; Comisión Revisora de Cuentas sobre Tesorería; Tribunal de Disciplina de oficio o rectificación; Presidentes/Vicepresidentes de Subcomisión sobre socios a su cargo; Jefes de Equipos Temporales sobre miembros de equipo.</w:t>
         <w:br/>
-        <w:t>5. Escalas de Sanciones: Inasistencia a reunión obligatoria (1 pto neg), inasistencia a Asamblea (2 ptos neg), omisión de mantenimiento/limpieza (2 ptos neg), omisión de tareas asignadas por CD/delegadas (llamado de atención hasta 2 ptos neg), llegadas tarde (llamado de atención o 0.5 ptos neg).</w:t>
+        <w:t>5. Escalas de Premios y Sanciones: Premios leves (0.5-1 pto), medios (1-2 ptos) y sobresalientes (2-4 ptos). Sanciones: Inasistencia a reunión obligatoria (1 pto neg), inasistencia a Asamblea (2 ptos neg), omisión de mantenimiento/limpieza (2 ptos neg), omisión de tareas asignadas por CD o autoridades delegadas (llamado de atención hasta 2 ptos neg), llegadas tarde (llamado de atención o 0.5 ptos neg).</w:t>
         <w:br/>
-        <w:t>6. Límite Crítico: 10 o más puntos negativos acumulados implican pérdida automática de la condición de socio (Art. 93). Fallos de mayoría absoluta irrecurribles (Art. 96 Estatuto).</w:t>
+        <w:t>6. Límite Crítico e Irrecurribilidad: Todo socio que acumule diez (10) o más puntos negativos netos pierde automáticamente su calidad de socio de AVEIT (Art. 93 del Reglamento Interno de Disciplina de AVEIT). Las decisiones del TD se adoptan por mayoría absoluta y son irrecurribles (Art. 96 del Estatuto Social de AVEIT).</w:t>
       </w:r>
     </w:p>
     <w:p>
@@ -2054,11 +2136,11 @@
         <w:spacing w:line="276" w:lineRule="auto" w:after="80"/>
       </w:pPr>
       <w:r>
-        <w:t>• Macroprocesos Estratégicos: Gestión de Gobierno y Asambleas, Planificación Directiva de Comisión Directiva (7 miembros), y Estrategia y Relaciones Institucionales del Viaje.</w:t>
+        <w:t>• Macroprocesos Estratégicos: Gestión de Gobierno y Asambleas, Planificación y Conducción Directiva (CD - 7 Miembros), y Estrategia y Relaciones Institucionales del Viaje.</w:t>
         <w:br/>
-        <w:t>• Macroprocesos Operativos / Misionales: Campaña y Admisión de Socios (Juniors), Formación de Habilidades Blandas, Gestión Operativa de las 7 Subcomisiones (Seniors), Logística del Viaje a Europa, y Eventos / Gran Rifa.</w:t>
+        <w:t>• Macroprocesos Operativos / Misionales: Campaña y Admisión Anual de Nuevos Socios (Juniors), Formación y Talleres de Habilidades Blandas, Gestión Operativa de las 7 Subcomisiones (Seniors), Logística, Itinerarios y Ejecución del Viaje a Europa, y Venta de Gran Rifa y Eventos de Recaudación.</w:t>
         <w:br/>
-        <w:t>• Macroprocesos de Soporte / Apoyo: Gestión del Tribunal de Disciplina y Premiaciones (foco SGD-AVEIT), Administración Financiera / Tesorería, Mantenimiento e Infraestructura, y Soporte Informático.</w:t>
+        <w:t>• Macroprocesos de Soporte / Apoyo: Gestión del Tribunal de Disciplina y Premiaciones (foco SGD-AVEIT), Administración Financiera, Cuotas y Tesorería, Mantenimiento Edilicio, Limpieza e Infraestructura, y Soporte Informático y Administración de Servidores.</w:t>
       </w:r>
     </w:p>
     <w:p>
@@ -2096,9 +2178,9 @@
         <w:spacing w:line="276" w:lineRule="auto" w:after="80"/>
       </w:pPr>
       <w:r>
-        <w:t>Disparador: Cierre de evento con inasistencias en sistema, reporte de omisión de tareas asignadas (llamado de atención a -2 pts), falta de limpieza o propuesta de premio elevada por autoridad competente (según Arts. 21 a 26).</w:t>
+        <w:t>Disparador: Cierre de evento con inasistencias en sistema, reporte de omisión de tareas asignadas (sancionable con llamado de atención a -2 pts), falta de limpieza o elevación de propuesta de premio por autoridad competente (según Arts. 21 a 26 del Reglamento Procesal Disciplinario 2026).</w:t>
         <w:br/>
-        <w:t>Actividades: La autoridad ingresa la solicitud T01 con hoja de Anexo formal; el sistema valida competencias, tipifica la falta y genera el expediente unívoco con sellado de tiempo.</w:t>
+        <w:t>Actividades: La autoridad habilitada accede e ingresa la solicitud T01 detallando los hechos en el Anexo; el sistema valida competencias del solicitante (Arts. 21 a 26 del Reglamento Procesal Disciplinario 2026), tipifica la falta según el catálogo reglamentario y genera el expediente unívoco con sellado de tiempo.</w:t>
         <w:br/>
         <w:t>Salida: Expediente en estado "Expediente Creado".</w:t>
       </w:r>
@@ -2115,7 +2197,7 @@
           <w:color w:val="003366"/>
           <w:sz w:val="23"/>
         </w:rPr>
-        <w:t>Proceso 2: Notificación Automática y Carga de Descargos (T02/T03 - 5 Días Hábiles)</w:t>
+        <w:t>Proceso 2: Notificación y Presentación de Descargos (Formularios T02 y T03 - 5 Días Hábiles)</w:t>
       </w:r>
     </w:p>
     <w:p>
@@ -2123,9 +2205,9 @@
         <w:spacing w:line="276" w:lineRule="auto" w:after="80"/>
       </w:pPr>
       <w:r>
-        <w:t>Disparador: Alta del expediente en sistema.</w:t>
+        <w:t>Disparador: Alta del expediente en el sistema.</w:t>
         <w:br/>
-        <w:t>Actividades: El sistema remite el acuse de sanción por correo e inicia el plazo preclusivo de 5 días hábiles. El socio ingresa al módulo "Mis Expedientes" desde su móvil o PC y completa el Formulario T02 (con certificados médicos/pasajes) o T03 (descargo extraordinario). El sistema valida la temporalidad e incorpora los adjuntos.</w:t>
+        <w:t>Actividades: El sistema remite el acuse de sanción vía correo electrónico e inicia la cuenta regresiva de cinco (5) días hábiles. El socio ingresa al módulo responsive "Mis Expedientes" y completa el Formulario T02 (con certificados médicos/pasajes) o Formulario T03 (descargo extraordinario). El sistema valida el plazo de presentación, sella digitalmente e incorpora los adjuntos.</w:t>
         <w:br/>
         <w:t>Salida: Expediente en estado "Las justificaciones están siendo revisadas".</w:t>
       </w:r>
@@ -2142,7 +2224,7 @@
           <w:color w:val="003366"/>
           <w:sz w:val="23"/>
         </w:rPr>
-        <w:t>Proceso 3: Sustanciación, Análisis, Votación y Resolución del TD (Firma Colegiada)</w:t>
+        <w:t>Proceso 3: Sustanciación, Análisis, Votación y Dictamen del Tribunal de Disciplina</w:t>
       </w:r>
     </w:p>
     <w:p>
@@ -2150,11 +2232,11 @@
         <w:spacing w:line="276" w:lineRule="auto" w:after="80"/>
       </w:pPr>
       <w:r>
-        <w:t>Disparador: Plazo de 5 días vencido o descargos presentados.</w:t>
+        <w:t>Disparador: Vencimiento del plazo de 5 días o recepción de justificaciones completas.</w:t>
         <w:br/>
-        <w:t>Actividades: En sesión virtual o presencial, el TD verifica conflictos de interés (activando suplentes); analiza pruebas y jurisprudencia; emite votos fundados en la plataforma web; redacta la Resolución (Vistos, Considerandos y Resolución) y se formaliza la firma digital de los miembros de tribunal.</w:t>
+        <w:t>Actividades: En sesión virtual o presencial, el TD verifica conflictos de interés (activando miembros suplentes si corresponde según Art. 95 del Estatuto Social de AVEIT); aprueba o rechaza descargos analizando antecedentes históricos; cada integrante emite su voto nominal fundado; se redacta la Resolución (Vistos, Considerandos y Resolución) y se formaliza la firma colegiada digital de miembros del tribunal.</w:t>
         <w:br/>
-        <w:t>Salida: Expediente en estado "Pendiente de firma y envío" y posterior "Expedientes ya emitidos".</w:t>
+        <w:t>Salida: Expediente en estado "En espera de resolución" y posterior paso a "Pendiente de firma y envío".</w:t>
       </w:r>
     </w:p>
     <w:p>
@@ -2169,7 +2251,7 @@
           <w:color w:val="003366"/>
           <w:sz w:val="23"/>
         </w:rPr>
-        <w:t>Proceso 4: Cómputo Transaccional, Publicación Transparente y Alertas de Límite</w:t>
+        <w:t>Proceso 4: Cómputo de Saldo de Puntos, Publicación y Alertas de Límite Crítico</w:t>
       </w:r>
     </w:p>
     <w:p>
@@ -2179,9 +2261,9 @@
       <w:r>
         <w:t>Disparador: Firma colegiada completa de la Resolución.</w:t>
         <w:br/>
-        <w:t>Actividades: El motor de reglas impacta la transacción en el saldo histórico de forma auditada (prohibición de UPDATE manual en DB MySQL). Se notifican las resoluciones y se publica en el panel transparente. Se evalúan alertas automáticas: Alerta Preventiva Amarilla (7 pts neg) y Alerta Crítica Roja de Pérdida Automática de Condición de Socio (10 pts neg).</w:t>
+        <w:t>Actividades: El motor de reglas impacta la transacción en el saldo histórico de forma auditada e irreversible (prohibición de UPDATE manual en DB MySQL). Se notifican las resoluciones y se publica en el panel de transparencia institucional. Evaluación de umbrales: Alerta Preventiva Amarilla (&gt;= 7 pts neg) y Alerta Crítica Roja de Pérdida Automática de Condición de Socio (&gt;= 10 pts neg) notificando fehacientemente al socio, CD y Comisión Fiscalizadora.</w:t>
         <w:br/>
-        <w:t>Salida: Saldo actualizado, publicación visible y alertas automáticas disparadas.</w:t>
+        <w:t>Salida: Saldo actualizado, publicación oficial visible y alertas automáticas disparadas.</w:t>
       </w:r>
     </w:p>
     <w:p>
@@ -2196,7 +2278,7 @@
           <w:color w:val="003366"/>
           <w:sz w:val="23"/>
         </w:rPr>
-        <w:t>Proceso 5: Auditorías Internas Cuatrimestrales y Emisión de Balances Oficiales (Art. 137)</w:t>
+        <w:t>Proceso 5: Auditorías Internas Cuatrimestrales y Emisión de Balances Oficiales (Art. 137 del Reglamento Interno de Disciplina de AVEIT)</w:t>
       </w:r>
     </w:p>
     <w:p>
@@ -2204,9 +2286,9 @@
         <w:spacing w:line="276" w:lineRule="auto" w:after="80"/>
       </w:pPr>
       <w:r>
-        <w:t>Disparador: Fecha de corte cuatrimestral estatutaria.</w:t>
+        <w:t>Disparador: Fecha de corte cuatrimestral estipulada por Estatuto (dos veces al año).</w:t>
         <w:br/>
-        <w:t>Actividades: Las autoridades seleccionan el período cuatrimestral en la plataforma web; el sistema compila instantáneamente el Informe y Balance Cuatrimestral de Premiaciones y Sanciones por subcomisión y grupo social (diferenciando Juniors y Seniors); se exporta firmado digitalmente para Comisión Directiva y Asamblea.</w:t>
+        <w:t>Actividades: Las autoridades del TD seleccionan el período cuatrimestral en la plataforma web; el sistema compila instantáneamente el Informe y Balance Cuatrimestral de Premiaciones y Sanciones por subcomisión y grupo social (diferenciando Juniors y Seniors); se consolidan las estadísticas y se exporta el informe oficial firmado digitalmente para Comisión Directiva y Asamblea General Ordinaria.</w:t>
         <w:br/>
         <w:t>Salida: Balance Cuatrimestral de Disciplina oficial listo para su tratamiento institucional.</w:t>
       </w:r>
@@ -2276,7 +2358,7 @@
                 <w:rFonts w:ascii="Calibri" w:hAnsi="Calibri"/>
                 <w:sz w:val="19"/>
               </w:rPr>
-              <w:t>Servidor físico/dedicado en la sede de AVEIT para alojamiento del sistema web institucional y servicios centrales.</w:t>
+              <w:t>Servidor físico / dedicado ubicado en la sede de AVEIT para alojamiento del sistema institucional web y servicios centrales.</w:t>
             </w:r>
           </w:p>
         </w:tc>
@@ -2366,7 +2448,7 @@
                 <w:rFonts w:ascii="Calibri" w:hAnsi="Calibri"/>
                 <w:sz w:val="19"/>
               </w:rPr>
-              <w:t>Motor MySQL centralizado con almacenamiento del padrón de socios y tablas institucionales.</w:t>
+              <w:t>Motor de base de datos relacional MySQL alojado en el servidor central que almacena el padrón de socios y tablas institucionales.</w:t>
             </w:r>
           </w:p>
         </w:tc>
@@ -2411,7 +2493,7 @@
                 <w:rFonts w:ascii="Calibri" w:hAnsi="Calibri"/>
                 <w:sz w:val="19"/>
               </w:rPr>
-              <w:t>Múltiples hojas de cálculo en Google Sheets mantenidas de forma aislada para registrar asistencias, puntos y notas.</w:t>
+              <w:t>Múltiples hojas de cálculo en Google Sheets mantenidas de forma aislada para registrar asistencias, puntos y notas, sin integración transaccional ni auditoría.</w:t>
             </w:r>
           </w:p>
         </w:tc>
@@ -2456,7 +2538,7 @@
                 <w:rFonts w:ascii="Calibri" w:hAnsi="Calibri"/>
                 <w:sz w:val="19"/>
               </w:rPr>
-              <w:t>Reuniones de deliberación y tratamiento de casos predominantemente virtuales, requiriendo una solución 100% Web y Responsive Mobile para operar desde smartphones y notebooks.</w:t>
+              <w:t>Sesiones de trabajo y deliberación predominantemente virtuales, requiriendo que la plataforma sea 100% Web y Responsive Mobile para operar desde smartphones, tablets o notebooks sin depender de terminales físicas.</w:t>
             </w:r>
           </w:p>
         </w:tc>
@@ -2501,7 +2583,7 @@
                 <w:rFonts w:ascii="Calibri" w:hAnsi="Calibri"/>
                 <w:sz w:val="19"/>
               </w:rPr>
-              <w:t>Computadoras de escritorio en Administración y Sala de TD, impresoras láser en red y equipamiento multimedia.</w:t>
+              <w:t>Computadoras de escritorio (PCs) en Administración y Sala de TD, impresoras láser en red y equipamiento multimedia.</w:t>
             </w:r>
           </w:p>
         </w:tc>
@@ -2546,7 +2628,7 @@
                 <w:rFonts w:ascii="Calibri" w:hAnsi="Calibri"/>
                 <w:sz w:val="19"/>
               </w:rPr>
-              <w:t>Acceso a internet y Wi-Fi provistos por la UTN FRC, cuentas institucionales de correo y plataformas de videoconferencia (Meet/Zoom/Discord).</w:t>
+              <w:t>Acceso a internet y red interna Wi-Fi provistos por la UTN FRC, cuentas institucionales de correo y plataformas de videoconferencia (Meet / Zoom / Discord).</w:t>
             </w:r>
           </w:p>
         </w:tc>
@@ -2572,7 +2654,7 @@
         <w:spacing w:line="276" w:lineRule="auto" w:after="80"/>
       </w:pPr>
       <w:r>
-        <w:t>La Sede Social de A.V.E.I.T. en el campus de UTN FRC dispone de cuatro sectores físicos (Aula de Estudio/Coworking para 35 personas, Sala de Reuniones de CD/TD para 12 personas con proyector, Oficina Administrativa con puestos informáticos y Rack de Servidor Python/MySQL, y Sala de Depósito/Archivo físico). No obstante, dado que las deliberaciones del Tribunal de Disciplina se desarrollan en modalidad virtual y remota, el sistema se diseñará como una plataforma 100% Web y Responsive Mobile.</w:t>
+        <w:t>La Sede Social de A.V.E.I.T. en el campus de la UTN FRC dispone de cuatro sectores físicos (Aula de Estudio y Coworking para 35 personas, Sala de Reuniones de CD y TD para 12 personas con proyector multimedia, Oficina Administrativa con puestos informáticos y Rack de Servidor Python/MySQL, y Sala de Depósito y Archivo físico de expedientes en papel). No obstante, dado que las deliberaciones del Tribunal de Disciplina se desarrollan en modalidad virtual y remota, el sistema se diseñará como una plataforma 100% Web y Responsive Mobile accesible vía internet.</w:t>
       </w:r>
     </w:p>
     <w:p>
@@ -2615,13 +2697,13 @@
           <w:b/>
           <w:color w:val="003366"/>
         </w:rPr>
-        <w:t xml:space="preserve">• 1. Descentralización y Fragmentación de Datos: </w:t>
+        <w:t xml:space="preserve">• 1. Descentralización, Fragmentación y Riesgo de Inconsistencia de Datos: </w:t>
       </w:r>
       <w:r>
         <w:rPr>
           <w:rFonts w:ascii="Calibri" w:hAnsi="Calibri"/>
         </w:rPr>
-        <w:t>Uso de múltiples planillas desconectadas en Google Sheets, generando duplicidad de registros y riesgo constante de inconsistencias o pérdida de información.</w:t>
+        <w:t>Uso de múltiples planillas de cálculo en Google Sheets mantenidas por distintas personas, generando duplicidad de información, desactualización de registros y riesgo constante de inconsistencias o pérdidas accidentales.</w:t>
       </w:r>
     </w:p>
     <w:p>
@@ -2634,13 +2716,13 @@
           <w:b/>
           <w:color w:val="003366"/>
         </w:rPr>
-        <w:t xml:space="preserve">• 2. Opacidad y Falta de Transparencia Pública: </w:t>
+        <w:t xml:space="preserve">• 2. Opacidad y Falta de Transparencia Pública Hacia los Socios: </w:t>
       </w:r>
       <w:r>
         <w:rPr>
           <w:rFonts w:ascii="Calibri" w:hAnsi="Calibri"/>
         </w:rPr>
-        <w:t>Limitaciones técnico-operativas del sistema actual que impiden que las resoluciones y justificaciones sean consultadas públicamente por los socios en tiempo real desde sus teléfonos o navegadores.</w:t>
+        <w:t>Limitaciones técnico-operativas actuales que impiden que las resoluciones y justificaciones sean consultadas públicamente por los socios en tiempo real desde sus teléfonos o navegadores.</w:t>
       </w:r>
     </w:p>
     <w:p>
@@ -2653,13 +2735,13 @@
           <w:b/>
           <w:color w:val="003366"/>
         </w:rPr>
-        <w:t xml:space="preserve">• 3. Modificación Directa y no Auditada en Base de Datos (UPDATE manual en MySQL): </w:t>
+        <w:t xml:space="preserve">• 3. Vulnerabilidad e Inexistencia de Auditoría en Modificaciones de Puntos (UPDATE Directo en DB MySQL): </w:t>
       </w:r>
       <w:r>
         <w:rPr>
           <w:rFonts w:ascii="Calibri" w:hAnsi="Calibri"/>
         </w:rPr>
-        <w:t>Ante correcciones en el puntaje de un expediente, se realizan sentencias UPDATE directas en la base de datos MySQL sin registro de autor, fecha ni justificativo, vulnerando la seguridad y trazabilidad.</w:t>
+        <w:t>Ante correcciones o errores materiales, se recurre a la ejecución de sentencias UPDATE manuales y directas sobre la base de datos MySQL, eliminando cualquier registro de auditoría, autoría o motivo.</w:t>
       </w:r>
     </w:p>
     <w:p>
@@ -2672,13 +2754,13 @@
           <w:b/>
           <w:color w:val="003366"/>
         </w:rPr>
-        <w:t xml:space="preserve">• 4. Carencia de un Registro Unificado de Jurisprudencia y Criterios: </w:t>
+        <w:t xml:space="preserve">• 4. Carencia de un Registro Unificado de Antecedentes y Jurisprudencia Interna: </w:t>
       </w:r>
       <w:r>
         <w:rPr>
           <w:rFonts w:ascii="Calibri" w:hAnsi="Calibri"/>
         </w:rPr>
-        <w:t>Falta de un repositorio histórico categorizado de resoluciones previas, lo que dificulta al TD consultar antecedentes para graduar penas o premios con uniformidad y equidad.</w:t>
+        <w:t>Inexistencia de un repositorio histórico categorizado de expedientes resueltos, dificultando al TD consultar antecedentes para graduar faltas o premios con uniformidad y equidad.</w:t>
       </w:r>
     </w:p>
     <w:p>
@@ -2697,7 +2779,7 @@
         <w:rPr>
           <w:rFonts w:ascii="Calibri" w:hAnsi="Calibri"/>
         </w:rPr>
-        <w:t>Comunicación dispersa de inasistencias o faltas por omisión de tareas asignadas (sancionables hasta con -2 pts) a través de chats o correos informales, provocando demoras y descontrol.</w:t>
+        <w:t>Las inasistencias a reuniones, omisiones de tareas en subcomisiones (sancionables hasta con -2 pts) o propuestas de mérito se remiten mediante canales dispersos (chats, correos informales), originando demoras considerables.</w:t>
       </w:r>
     </w:p>
     <w:p>
@@ -2716,7 +2798,7 @@
         <w:rPr>
           <w:rFonts w:ascii="Calibri" w:hAnsi="Calibri"/>
         </w:rPr>
-        <w:t>Cómputo manual del plazo de 5 días hábiles para presentar formularios T02/T03 tras el acuse de sanción, careciendo de sellado de tiempo fehaciente.</w:t>
+        <w:t>Cómputo manual del plazo de 5 días hábiles para presentar formularios T02/T03 tras el acuse de sanción, sin marca de tiempo fehaciente ni constancia digital inalterable.</w:t>
       </w:r>
     </w:p>
     <w:p>
@@ -2729,13 +2811,13 @@
           <w:b/>
           <w:color w:val="003366"/>
         </w:rPr>
-        <w:t xml:space="preserve">• 7. Riesgo de Error Humano en el Cómputo y Falta de Alertas de Límite Sancionatorio: </w:t>
+        <w:t xml:space="preserve">• 7. Riesgo Humano en el Cómputo de Saldos y Falta de Alertas Tempranas del Límite Sancionatorio: </w:t>
       </w:r>
       <w:r>
         <w:rPr>
           <w:rFonts w:ascii="Calibri" w:hAnsi="Calibri"/>
         </w:rPr>
-        <w:t>Cálculo manual del saldo neto de puntos acumulados, con riesgo de omisión en la detección oportuna de socios que alcanzan los 10 puntos negativos (pérdida automática de condición de socio).</w:t>
+        <w:t>Cálculo manual del saldo neto de puntos acumulados en planillas, exponiendo a la institución a errores humanos críticos en la detección oportuna de socios que alcanzan o superan los 10 puntos negativos (pérdida automática de condición de socio).</w:t>
       </w:r>
     </w:p>
     <w:p>
@@ -2748,13 +2830,13 @@
           <w:b/>
           <w:color w:val="003366"/>
         </w:rPr>
-        <w:t xml:space="preserve">• 8. Omisión en la Confección y Presentación de Balances Cuatrimestrales (Art. 137): </w:t>
+        <w:t xml:space="preserve">• 8. Omisión en la Confección y Presentación de Balances de Auditoría Cuatrimestral (Art. 137 del Reglamento Interno de Disciplina de AVEIT): </w:t>
       </w:r>
       <w:r>
         <w:rPr>
           <w:rFonts w:ascii="Calibri" w:hAnsi="Calibri"/>
         </w:rPr>
-        <w:t>Debido a la enorme complejidad de consolidar a mano decenas de planillas, actualmente el TD no logra emitir los balances cuatrimestrales exigidos por el marco reglamentario, limitando la rendición de cuentas ante CD y Asambleas.</w:t>
+        <w:t>Debido a la enorme complejidad de consolidar a mano decenas de planillas y actas, actualmente el TD no logra emitir ni presentar formalmente los dos (2) balances cuatrimestrales de auditoría exigidos por el Reglamento Interno de Disciplina, limitando la rendición de cuentas ante Comisión Directiva y Asambleas.</w:t>
       </w:r>
     </w:p>
     <w:p>
@@ -2773,7 +2855,7 @@
         <w:rPr>
           <w:rFonts w:ascii="Calibri" w:hAnsi="Calibri"/>
         </w:rPr>
-        <w:t>Las deliberaciones del TD son predominantemente virtuales; la falta de una herramienta web responsive dificulta la votación estructurada, la firma colegiada de miembros y la emisión ágil de fallos.</w:t>
+        <w:t>Dado que las deliberaciones del Tribunal de Disciplina se desarrollan mayoritariamente en formato virtual, la falta de una herramienta web responsive obliga a compartir archivos estáticos durante videollamadas, dificultando la recolección ágil de firmas colegiadas y la emisión formal de resoluciones.</w:t>
       </w:r>
     </w:p>
     <w:p>
@@ -2807,7 +2889,7 @@
         <w:rPr>
           <w:rFonts w:ascii="Calibri" w:hAnsi="Calibri"/>
         </w:rPr>
-        <w:t>Centralización total de las actuaciones disciplinarias en la base de datos MySQL conectada al backend Python, con integridad referencial y respaldos automáticos.</w:t>
+        <w:t>Centralización de todas las actuaciones disciplinarias y de premiación en la base de datos relacional MySQL integrada al backend en Python, garantizando integridad referencial, consistencia transaccional y respaldos automáticos.</w:t>
       </w:r>
     </w:p>
     <w:p>
@@ -2826,7 +2908,7 @@
         <w:rPr>
           <w:rFonts w:ascii="Calibri" w:hAnsi="Calibri"/>
         </w:rPr>
-        <w:t>Acceso autónomo y adaptativo para que todos los socios consulten resoluciones publicadas, fundamentos y su estado de puntos desde smartphones, tablets o PC en el módulo "Mis Expedientes".</w:t>
+        <w:t>Implementación de una interfaz web moderna y adaptativa para smartphones, tablets y computadoras, donde cada socio podrá consultar en todo momento su historial de puntos, resoluciones publicadas y estado de sus trámites en el módulo "Mis Expedientes".</w:t>
       </w:r>
     </w:p>
     <w:p>
@@ -2839,13 +2921,13 @@
           <w:b/>
           <w:color w:val="2980B9"/>
         </w:rPr>
-        <w:t xml:space="preserve">• 3. Trazabilidad Absoluta y Pistas de Auditoría en Modificaciones: </w:t>
+        <w:t xml:space="preserve">• 3. Trazabilidad Absoluta y Pistas de Auditoría en Modificaciones de Expedientes: </w:t>
       </w:r>
       <w:r>
         <w:rPr>
           <w:rFonts w:ascii="Calibri" w:hAnsi="Calibri"/>
         </w:rPr>
-        <w:t>Eliminación definitiva de modificaciones directas en MySQL. Cualquier ajuste de puntos requerirá un flujo auditado con justificación y firma digital.</w:t>
+        <w:t>Erradicación definitiva de modificaciones directas sobre la base de datos MySQL. Toda rectificación, reconsideración o ajuste de puntaje se realizará mediante flujos auditados en la aplicación que registrarán el usuario responsable, fecha/hora, justificativo y versión anterior.</w:t>
       </w:r>
     </w:p>
     <w:p>
@@ -2858,13 +2940,13 @@
           <w:b/>
           <w:color w:val="2980B9"/>
         </w:rPr>
-        <w:t xml:space="preserve">• 4. Repositorio de Precedentes y Catálogo de Graduación Homogénea: </w:t>
+        <w:t xml:space="preserve">• 4. Repositorio de Antecedentes y Catálogo de Graduación Homogénea: </w:t>
       </w:r>
       <w:r>
         <w:rPr>
           <w:rFonts w:ascii="Calibri" w:hAnsi="Calibri"/>
         </w:rPr>
-        <w:t>Motor de búsqueda de antecedentes disciplinarios y clasificador según el Reglamento 2026 y la Circular 001/2026 para asegurar fallos justos y homogéneos.</w:t>
+        <w:t>Disponibilidad de un motor de búsqueda de expedientes históricos y una matriz de tipificación alineada a la Circular 001/2026 del Tribunal de Disciplina y al Reglamento Interno de Disciplina de AVEIT, garantizando fallos equitativos, predecibles y homogéneos.</w:t>
       </w:r>
     </w:p>
     <w:p>
@@ -2883,7 +2965,7 @@
         <w:rPr>
           <w:rFonts w:ascii="Calibri" w:hAnsi="Calibri"/>
         </w:rPr>
-        <w:t>Habilitación de módulos específicos para la carga digital de solicitudes T01 (con Anexo) por autoridades, justificaciones T02 tipificadas con adjuntos y descargos extraordinarios T03, eliminando el soporte en papel.</w:t>
+        <w:t>Habilitación de módulos específicos para la carga digital de solicitudes T01 (con Anexo) por autoridades, justificaciones T02 tipificadas con adjuntos y descargos extraordinarios T03, eliminando el uso de papel y la entrega presencial en sede.</w:t>
       </w:r>
     </w:p>
     <w:p>
@@ -2896,13 +2978,13 @@
           <w:b/>
           <w:color w:val="2980B9"/>
         </w:rPr>
-        <w:t xml:space="preserve">• 6. Motor Automatizado de Control de Plazos y Notificaciones: </w:t>
+        <w:t xml:space="preserve">• 6. Motor Automatizado de Control de Plazos y Notificaciones Digitales: </w:t>
       </w:r>
       <w:r>
         <w:rPr>
           <w:rFonts w:ascii="Calibri" w:hAnsi="Calibri"/>
         </w:rPr>
-        <w:t>Temporizadores de cálculo de plazos preclusivos de 5 días hábiles para justificaciones y notificaciones electrónicas automáticas con sellado de tiempo fehaciente.</w:t>
+        <w:t>Temporizadores automáticos que calculan con precisión milimétrica los plazos preclusivos de 5 días hábiles para justificaciones, vencimientos y prescripciones, emitiendo acuses de sanción y resoluciones digitales con sellado de tiempo.</w:t>
       </w:r>
     </w:p>
     <w:p>
@@ -2915,13 +2997,13 @@
           <w:b/>
           <w:color w:val="2980B9"/>
         </w:rPr>
-        <w:t xml:space="preserve">• 7. Cómputo Transaccional y Sistema de Alarmas Escalonadas: </w:t>
+        <w:t xml:space="preserve">• 7. Cómputo Transaccional Automatizado y Sistema de Alarmas Escalonadas: </w:t>
       </w:r>
       <w:r>
         <w:rPr>
           <w:rFonts w:ascii="Calibri" w:hAnsi="Calibri"/>
         </w:rPr>
-        <w:t>Actualización inmediata del saldo de puntos y disparo automático de alertas (Alerta Preventiva a los 7 puntos negativos y Alerta Roja a los 10 puntos negativos hacia el socio, CD y Comisión Fiscalizadora).</w:t>
+        <w:t>Actualización en tiempo real del saldo de puntos de cada socio y disparo automático de alertas escalonadas (advertencia preventiva a los 7 puntos negativos y alerta roja automática a los 10 puntos negativos hacia el socio, CD y Comisión Fiscalizadora).</w:t>
       </w:r>
     </w:p>
     <w:p>
@@ -2934,13 +3016,13 @@
           <w:b/>
           <w:color w:val="2980B9"/>
         </w:rPr>
-        <w:t xml:space="preserve">• 8. Generación Instantánea de Balances Cuatrimestrales y Reportes (Art. 137): </w:t>
+        <w:t xml:space="preserve">• 8. Generación Instantánea de Balances Cuatrimestrales y Reportes de Auditoría (Art. 137 del Reglamento Interno de Disciplina de AVEIT): </w:t>
       </w:r>
       <w:r>
         <w:rPr>
           <w:rFonts w:ascii="Calibri" w:hAnsi="Calibri"/>
         </w:rPr>
-        <w:t>Emisión con un solo clic de los Balances e Informes de Auditoría Cuatrimestral en formato ejecutivo para Asambleas Ordinarias y CD, permitiendo al TD cumplir sin esfuerzo con el marco normativo.</w:t>
+        <w:t>Capacidad de emitir con un solo clic los Informes y Balances Cuatrimestrales de Auditoría Interna en formatos ejecutivos para Asambleas Ordinarias y Comisión Directiva, permitiendo al TD cumplir de manera natural y sin esfuerzo con el marco reglamentario.</w:t>
       </w:r>
     </w:p>
     <w:p>
@@ -2959,7 +3041,7 @@
         <w:rPr>
           <w:rFonts w:ascii="Calibri" w:hAnsi="Calibri"/>
         </w:rPr>
-        <w:t>Herramientas integradas en la plataforma web que permiten a las miembros del TD conectarse desde sus dispositivos móviles durante reuniones virtuales, emitir votos nominales fundados, registrar firmas colegiadas de Socios Seniors y promulgar resoluciones inmediatas.</w:t>
+        <w:t>Herramientas integradas en la plataforma web que permiten a las miembros del TD conectarse desde sus dispositivos móviles durante las reuniones virtuales, emitir votos nominales fundados, registrar firmas colegiadas de Socios Seniors y promulgar resoluciones con validez formal inmediata.</w:t>
       </w:r>
     </w:p>
     <w:sectPr>

</xml_diff>